<commit_message>
M068 T2-T7: hitopbr_devstats, interval_hitopbr(), and the item-36 keying correction
- hitopbr_items row 36 (HiTOP_69) moves from Detachment to Internalizing, the
  scale the development workbook gives it in both its item-to-scale sheet and
  its scoring syntax; data, the two Word forms and the manifest rebuilt.
- hitopbr_devstats ships Table 1's eight Superspectra and Spectra rows, built
  from the hand transcription and diffed against an independent coordinate
  extraction by data-raw/verify_hitopbr_devstats.R.
- interval_hitopbr() wraps interval_engine() against that table.
- Tests: a closed-form oracle over all eight scales, the CI-runnable item-count
  invariant, both condition classes, the workbook membership oracle, and a
  prose guard over the four surfaces that show the development-sample caveat.
</commit_message>
<xml_diff>
--- a/inst/extdata/hitopbr_A4.docx
+++ b/inst/extdata/hitopbr_A4.docx
@@ -13209,7 +13209,7 @@
                 <w:szCs w:val="18"/>
                 <w:color w:val="000000"/>
               </w:rPr>
-              <w:t xml:space="preserve">8, 9, 18, 22, 23, 42, 44</w:t>
+              <w:t xml:space="preserve">8, 9, 18, 22, 23, 36, 42, 44</w:t>
             </w:r>
           </w:p>
         </w:tc>
@@ -13324,7 +13324,7 @@
                 <w:szCs w:val="18"/>
                 <w:color w:val="000000"/>
               </w:rPr>
-              <w:t xml:space="preserve">7, 12, 30, 31, 36, 37</w:t>
+              <w:t xml:space="preserve">7, 12, 30, 31, 37</w:t>
             </w:r>
           </w:p>
         </w:tc>
@@ -13935,7 +13935,7 @@
         <w:szCs w:val="16"/>
         <w:color w:val="BEBEBE"/>
       </w:rPr>
-      <w:t xml:space="preserve">Generated 2026-07-16 · hitop 0.2.0</w:t>
+      <w:t xml:space="preserve">Generated 2026-08-30 · hitop 0.2.0</w:t>
     </w:r>
     <w:r>
       <w:rPr>

</xml_diff>

<commit_message>
M068: HiTOP-BR score intervals against the paper's development sample (#74)
Adds interval_hitopbr() and the hitopbr_devstats reference table, transcribed from the Superspectra and Spectra block of the HiTOP-SR introduction paper's Table 1 and verified cell by cell against an independent coordinate extraction. Corrects the HiTOP-BR keying of item 36 from Detachment to Internalizing, per the development workbook and the paper's factor table, and rebuilds both HiTOP-BR Word forms.
</commit_message>
<xml_diff>
--- a/inst/extdata/hitopbr_A4.docx
+++ b/inst/extdata/hitopbr_A4.docx
@@ -13209,7 +13209,7 @@
                 <w:szCs w:val="18"/>
                 <w:color w:val="000000"/>
               </w:rPr>
-              <w:t xml:space="preserve">8, 9, 18, 22, 23, 42, 44</w:t>
+              <w:t xml:space="preserve">8, 9, 18, 22, 23, 36, 42, 44</w:t>
             </w:r>
           </w:p>
         </w:tc>
@@ -13324,7 +13324,7 @@
                 <w:szCs w:val="18"/>
                 <w:color w:val="000000"/>
               </w:rPr>
-              <w:t xml:space="preserve">7, 12, 30, 31, 36, 37</w:t>
+              <w:t xml:space="preserve">7, 12, 30, 31, 37</w:t>
             </w:r>
           </w:p>
         </w:tc>
@@ -13935,7 +13935,7 @@
         <w:szCs w:val="16"/>
         <w:color w:val="BEBEBE"/>
       </w:rPr>
-      <w:t xml:space="preserve">Generated 2026-07-16 · hitop 0.2.0</w:t>
+      <w:t xml:space="preserve">Generated 2026-08-30 · hitop 0.2.0</w:t>
     </w:r>
     <w:r>
       <w:rPr>

</xml_diff>